<commit_message>
created packages in src
</commit_message>
<xml_diff>
--- a/02-flowchart/flowchart.docx
+++ b/02-flowchart/flowchart.docx
@@ -164,6 +164,8 @@
           <w:lang w:val="en-US"/>
         </w:rPr>
       </w:pPr>
+      <w:bookmarkStart w:id="0" w:name="_GoBack"/>
+      <w:bookmarkEnd w:id="0"/>
       <w:r>
         <w:rPr>
           <w:sz w:val="20"/>
@@ -688,7 +690,7 @@
           <w:rFonts w:hint="default"/>
           <w:lang w:val="en-US"/>
         </w:rPr>
-        <w:t xml:space="preserve">Condition   </w:t>
+        <w:t>Condition   (Diamond)</w:t>
       </w:r>
     </w:p>
     <w:p>
@@ -1619,14 +1621,6 @@
           <w:lang w:val="en-IN"/>
         </w:rPr>
       </w:pPr>
-    </w:p>
-    <w:p>
-      <w:pPr>
-        <w:rPr>
-          <w:rFonts w:hint="default"/>
-          <w:lang w:val="en-IN"/>
-        </w:rPr>
-      </w:pPr>
       <w:r>
         <w:rPr>
           <w:rFonts w:hint="default"/>
@@ -1655,11 +1649,260 @@
       <w:pPr>
         <w:rPr>
           <w:rFonts w:hint="default"/>
-          <w:lang w:val="en-IN"/>
-        </w:rPr>
-      </w:pPr>
-      <w:bookmarkStart w:id="0" w:name="_GoBack"/>
-      <w:bookmarkEnd w:id="0"/>
+          <w:sz w:val="20"/>
+          <w:lang w:val="en-US"/>
+        </w:rPr>
+      </w:pPr>
+      <w:r>
+        <w:rPr>
+          <w:sz w:val="20"/>
+        </w:rPr>
+        <mc:AlternateContent>
+          <mc:Choice Requires="wps">
+            <w:drawing>
+              <wp:anchor distT="0" distB="0" distL="114300" distR="114300" simplePos="0" relativeHeight="251682816" behindDoc="0" locked="0" layoutInCell="1" allowOverlap="1">
+                <wp:simplePos x="0" y="0"/>
+                <wp:positionH relativeFrom="column">
+                  <wp:posOffset>504825</wp:posOffset>
+                </wp:positionH>
+                <wp:positionV relativeFrom="paragraph">
+                  <wp:posOffset>2471420</wp:posOffset>
+                </wp:positionV>
+                <wp:extent cx="99695" cy="287655"/>
+                <wp:effectExtent l="15240" t="6350" r="22225" b="10795"/>
+                <wp:wrapNone/>
+                <wp:docPr id="27" name="Down Arrow 27"/>
+                <wp:cNvGraphicFramePr/>
+                <a:graphic xmlns:a="http://schemas.openxmlformats.org/drawingml/2006/main">
+                  <a:graphicData uri="http://schemas.microsoft.com/office/word/2010/wordprocessingShape">
+                    <wps:wsp>
+                      <wps:cNvSpPr/>
+                      <wps:spPr>
+                        <a:xfrm>
+                          <a:off x="1647825" y="9634220"/>
+                          <a:ext cx="99695" cy="287655"/>
+                        </a:xfrm>
+                        <a:prstGeom prst="downArrow">
+                          <a:avLst/>
+                        </a:prstGeom>
+                      </wps:spPr>
+                      <wps:style>
+                        <a:lnRef idx="2">
+                          <a:schemeClr val="accent1">
+                            <a:lumMod val="75000"/>
+                          </a:schemeClr>
+                        </a:lnRef>
+                        <a:fillRef idx="1">
+                          <a:schemeClr val="accent1"/>
+                        </a:fillRef>
+                        <a:effectRef idx="0">
+                          <a:srgbClr val="FFFFFF"/>
+                        </a:effectRef>
+                        <a:fontRef idx="minor">
+                          <a:schemeClr val="lt1"/>
+                        </a:fontRef>
+                      </wps:style>
+                      <wps:bodyPr rot="0" spcFirstLastPara="0" vertOverflow="overflow" horzOverflow="overflow" vert="horz" wrap="square" lIns="91440" tIns="45720" rIns="91440" bIns="45720" numCol="1" spcCol="0" rtlCol="0" fromWordArt="0" anchor="ctr" anchorCtr="0" forceAA="0" compatLnSpc="1">
+                        <a:noAutofit/>
+                      </wps:bodyPr>
+                    </wps:wsp>
+                  </a:graphicData>
+                </a:graphic>
+              </wp:anchor>
+            </w:drawing>
+          </mc:Choice>
+          <mc:Fallback>
+            <w:pict>
+              <v:shape id="_x0000_s1026" o:spid="_x0000_s1026" o:spt="67" type="#_x0000_t67" style="position:absolute;left:0pt;margin-left:39.75pt;margin-top:194.6pt;height:22.65pt;width:7.85pt;z-index:251682816;v-text-anchor:middle;mso-width-relative:page;mso-height-relative:page;" fillcolor="#5B9BD5 [3204]" filled="t" stroked="t" coordsize="21600,21600" o:gfxdata="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" adj="17857,5400">
+                <v:fill on="t" focussize="0,0"/>
+                <v:stroke weight="1pt" color="#2E75B6 [2404]" miterlimit="8" joinstyle="miter"/>
+                <v:imagedata o:title=""/>
+                <o:lock v:ext="edit" aspectratio="f"/>
+              </v:shape>
+            </w:pict>
+          </mc:Fallback>
+        </mc:AlternateContent>
+      </w:r>
+      <w:r>
+        <w:rPr>
+          <w:sz w:val="20"/>
+        </w:rPr>
+        <mc:AlternateContent>
+          <mc:Choice Requires="wps">
+            <w:drawing>
+              <wp:anchor distT="0" distB="0" distL="114300" distR="114300" simplePos="0" relativeHeight="251680768" behindDoc="0" locked="0" layoutInCell="1" allowOverlap="1">
+                <wp:simplePos x="0" y="0"/>
+                <wp:positionH relativeFrom="column">
+                  <wp:posOffset>543560</wp:posOffset>
+                </wp:positionH>
+                <wp:positionV relativeFrom="paragraph">
+                  <wp:posOffset>1181100</wp:posOffset>
+                </wp:positionV>
+                <wp:extent cx="105410" cy="264160"/>
+                <wp:effectExtent l="15240" t="6350" r="16510" b="19050"/>
+                <wp:wrapNone/>
+                <wp:docPr id="25" name="Down Arrow 25"/>
+                <wp:cNvGraphicFramePr/>
+                <a:graphic xmlns:a="http://schemas.openxmlformats.org/drawingml/2006/main">
+                  <a:graphicData uri="http://schemas.microsoft.com/office/word/2010/wordprocessingShape">
+                    <wps:wsp>
+                      <wps:cNvSpPr/>
+                      <wps:spPr>
+                        <a:xfrm>
+                          <a:off x="1686560" y="8326120"/>
+                          <a:ext cx="105410" cy="264160"/>
+                        </a:xfrm>
+                        <a:prstGeom prst="downArrow">
+                          <a:avLst/>
+                        </a:prstGeom>
+                      </wps:spPr>
+                      <wps:style>
+                        <a:lnRef idx="2">
+                          <a:schemeClr val="accent1">
+                            <a:lumMod val="75000"/>
+                          </a:schemeClr>
+                        </a:lnRef>
+                        <a:fillRef idx="1">
+                          <a:schemeClr val="accent1"/>
+                        </a:fillRef>
+                        <a:effectRef idx="0">
+                          <a:srgbClr val="FFFFFF"/>
+                        </a:effectRef>
+                        <a:fontRef idx="minor">
+                          <a:schemeClr val="lt1"/>
+                        </a:fontRef>
+                      </wps:style>
+                      <wps:bodyPr rot="0" spcFirstLastPara="0" vertOverflow="overflow" horzOverflow="overflow" vert="horz" wrap="square" lIns="91440" tIns="45720" rIns="91440" bIns="45720" numCol="1" spcCol="0" rtlCol="0" fromWordArt="0" anchor="ctr" anchorCtr="0" forceAA="0" compatLnSpc="1">
+                        <a:noAutofit/>
+                      </wps:bodyPr>
+                    </wps:wsp>
+                  </a:graphicData>
+                </a:graphic>
+              </wp:anchor>
+            </w:drawing>
+          </mc:Choice>
+          <mc:Fallback>
+            <w:pict>
+              <v:shape id="_x0000_s1026" o:spid="_x0000_s1026" o:spt="67" type="#_x0000_t67" style="position:absolute;left:0pt;margin-left:42.8pt;margin-top:93pt;height:20.8pt;width:8.3pt;z-index:251680768;v-text-anchor:middle;mso-width-relative:page;mso-height-relative:page;" fillcolor="#5B9BD5 [3204]" filled="t" stroked="t" coordsize="21600,21600" o:gfxdata="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" adj="17291,5400">
+                <v:fill on="t" focussize="0,0"/>
+                <v:stroke weight="1pt" color="#2E75B6 [2404]" miterlimit="8" joinstyle="miter"/>
+                <v:imagedata o:title=""/>
+                <o:lock v:ext="edit" aspectratio="f"/>
+              </v:shape>
+            </w:pict>
+          </mc:Fallback>
+        </mc:AlternateContent>
+      </w:r>
+      <w:r>
+        <w:rPr>
+          <w:sz w:val="20"/>
+        </w:rPr>
+        <mc:AlternateContent>
+          <mc:Choice Requires="wps">
+            <w:drawing>
+              <wp:anchor distT="0" distB="0" distL="114300" distR="114300" simplePos="0" relativeHeight="251674624" behindDoc="0" locked="0" layoutInCell="1" allowOverlap="1">
+                <wp:simplePos x="0" y="0"/>
+                <wp:positionH relativeFrom="column">
+                  <wp:posOffset>271145</wp:posOffset>
+                </wp:positionH>
+                <wp:positionV relativeFrom="paragraph">
+                  <wp:posOffset>71755</wp:posOffset>
+                </wp:positionV>
+                <wp:extent cx="1025525" cy="323850"/>
+                <wp:effectExtent l="6350" t="6350" r="19685" b="20320"/>
+                <wp:wrapNone/>
+                <wp:docPr id="18" name="Flowchart: Terminator 18"/>
+                <wp:cNvGraphicFramePr/>
+                <a:graphic xmlns:a="http://schemas.openxmlformats.org/drawingml/2006/main">
+                  <a:graphicData uri="http://schemas.microsoft.com/office/word/2010/wordprocessingShape">
+                    <wps:wsp>
+                      <wps:cNvSpPr/>
+                      <wps:spPr>
+                        <a:xfrm>
+                          <a:off x="1533525" y="7819390"/>
+                          <a:ext cx="1025525" cy="323850"/>
+                        </a:xfrm>
+                        <a:prstGeom prst="flowChartTerminator">
+                          <a:avLst/>
+                        </a:prstGeom>
+                      </wps:spPr>
+                      <wps:style>
+                        <a:lnRef idx="2">
+                          <a:schemeClr val="accent1">
+                            <a:lumMod val="75000"/>
+                          </a:schemeClr>
+                        </a:lnRef>
+                        <a:fillRef idx="1">
+                          <a:schemeClr val="accent1"/>
+                        </a:fillRef>
+                        <a:effectRef idx="0">
+                          <a:srgbClr val="FFFFFF"/>
+                        </a:effectRef>
+                        <a:fontRef idx="minor">
+                          <a:schemeClr val="lt1"/>
+                        </a:fontRef>
+                      </wps:style>
+                      <wps:txbx>
+                        <w:txbxContent>
+                          <w:p>
+                            <w:pPr>
+                              <w:jc w:val="center"/>
+                              <w:rPr>
+                                <w:rFonts w:hint="default"/>
+                                <w:lang w:val="en-IN"/>
+                              </w:rPr>
+                            </w:pPr>
+                            <w:r>
+                              <w:rPr>
+                                <w:rFonts w:hint="default"/>
+                                <w:lang w:val="en-IN"/>
+                              </w:rPr>
+                              <w:t>start</w:t>
+                            </w:r>
+                          </w:p>
+                        </w:txbxContent>
+                      </wps:txbx>
+                      <wps:bodyPr rot="0" spcFirstLastPara="0" vertOverflow="overflow" horzOverflow="overflow" vert="horz" wrap="square" lIns="91440" tIns="45720" rIns="91440" bIns="45720" numCol="1" spcCol="0" rtlCol="0" fromWordArt="0" anchor="ctr" anchorCtr="0" forceAA="0" compatLnSpc="1">
+                        <a:noAutofit/>
+                      </wps:bodyPr>
+                    </wps:wsp>
+                  </a:graphicData>
+                </a:graphic>
+              </wp:anchor>
+            </w:drawing>
+          </mc:Choice>
+          <mc:Fallback>
+            <w:pict>
+              <v:shape id="_x0000_s1026" o:spid="_x0000_s1026" o:spt="116" type="#_x0000_t116" style="position:absolute;left:0pt;margin-left:21.35pt;margin-top:5.65pt;height:25.5pt;width:80.75pt;z-index:251674624;v-text-anchor:middle;mso-width-relative:page;mso-height-relative:page;" fillcolor="#5B9BD5 [3204]" filled="t" stroked="t" coordsize="21600,21600" o:gfxdata="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">
+                <v:fill on="t" focussize="0,0"/>
+                <v:stroke weight="1pt" color="#2E75B6 [2404]" miterlimit="8" joinstyle="miter"/>
+                <v:imagedata o:title=""/>
+                <o:lock v:ext="edit" aspectratio="f"/>
+                <v:textbox>
+                  <w:txbxContent>
+                    <w:p>
+                      <w:pPr>
+                        <w:jc w:val="center"/>
+                        <w:rPr>
+                          <w:rFonts w:hint="default"/>
+                          <w:lang w:val="en-IN"/>
+                        </w:rPr>
+                      </w:pPr>
+                      <w:r>
+                        <w:rPr>
+                          <w:rFonts w:hint="default"/>
+                          <w:lang w:val="en-IN"/>
+                        </w:rPr>
+                        <w:t>start</w:t>
+                      </w:r>
+                    </w:p>
+                  </w:txbxContent>
+                </v:textbox>
+              </v:shape>
+            </w:pict>
+          </mc:Fallback>
+        </mc:AlternateContent>
+      </w:r>
       <w:r>
         <w:rPr>
           <w:sz w:val="20"/>
@@ -1670,10 +1913,10 @@
               <wp:anchor distT="0" distB="0" distL="114300" distR="114300" simplePos="0" relativeHeight="251676672" behindDoc="0" locked="0" layoutInCell="1" allowOverlap="1">
                 <wp:simplePos x="0" y="0"/>
                 <wp:positionH relativeFrom="column">
-                  <wp:posOffset>102235</wp:posOffset>
+                  <wp:posOffset>138430</wp:posOffset>
                 </wp:positionH>
                 <wp:positionV relativeFrom="paragraph">
-                  <wp:posOffset>1394460</wp:posOffset>
+                  <wp:posOffset>1453515</wp:posOffset>
                 </wp:positionV>
                 <wp:extent cx="875665" cy="384175"/>
                 <wp:effectExtent l="6350" t="6350" r="17145" b="20955"/>
@@ -1740,7 +1983,7 @@
           </mc:Choice>
           <mc:Fallback>
             <w:pict>
-              <v:shape id="_x0000_s1026" o:spid="_x0000_s1026" o:spt="109" type="#_x0000_t109" style="position:absolute;left:0pt;margin-left:8.05pt;margin-top:109.8pt;height:30.25pt;width:68.95pt;z-index:251676672;v-text-anchor:middle;mso-width-relative:page;mso-height-relative:page;" fillcolor="#5B9BD5 [3204]" filled="t" stroked="t" coordsize="21600,21600" o:gfxdata="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">
+              <v:shape id="_x0000_s1026" o:spid="_x0000_s1026" o:spt="109" type="#_x0000_t109" style="position:absolute;left:0pt;margin-left:10.9pt;margin-top:114.45pt;height:30.25pt;width:68.95pt;z-index:251676672;v-text-anchor:middle;mso-width-relative:page;mso-height-relative:page;" fillcolor="#5B9BD5 [3204]" filled="t" stroked="t" coordsize="21600,21600" o:gfxdata="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">
                 <v:fill on="t" focussize="0,0"/>
                 <v:stroke weight="1pt" color="#2E75B6 [2404]" miterlimit="8" joinstyle="miter"/>
                 <v:imagedata o:title=""/>
@@ -1997,186 +2240,6 @@
         <mc:AlternateContent>
           <mc:Choice Requires="wps">
             <w:drawing>
-              <wp:anchor distT="0" distB="0" distL="114300" distR="114300" simplePos="0" relativeHeight="251674624" behindDoc="0" locked="0" layoutInCell="1" allowOverlap="1">
-                <wp:simplePos x="0" y="0"/>
-                <wp:positionH relativeFrom="column">
-                  <wp:posOffset>162560</wp:posOffset>
-                </wp:positionH>
-                <wp:positionV relativeFrom="paragraph">
-                  <wp:posOffset>59690</wp:posOffset>
-                </wp:positionV>
-                <wp:extent cx="1025525" cy="323850"/>
-                <wp:effectExtent l="6350" t="6350" r="19685" b="20320"/>
-                <wp:wrapNone/>
-                <wp:docPr id="18" name="Flowchart: Terminator 18"/>
-                <wp:cNvGraphicFramePr/>
-                <a:graphic xmlns:a="http://schemas.openxmlformats.org/drawingml/2006/main">
-                  <a:graphicData uri="http://schemas.microsoft.com/office/word/2010/wordprocessingShape">
-                    <wps:wsp>
-                      <wps:cNvSpPr/>
-                      <wps:spPr>
-                        <a:xfrm>
-                          <a:off x="1533525" y="7819390"/>
-                          <a:ext cx="1025525" cy="323850"/>
-                        </a:xfrm>
-                        <a:prstGeom prst="flowChartTerminator">
-                          <a:avLst/>
-                        </a:prstGeom>
-                      </wps:spPr>
-                      <wps:style>
-                        <a:lnRef idx="2">
-                          <a:schemeClr val="accent1">
-                            <a:lumMod val="75000"/>
-                          </a:schemeClr>
-                        </a:lnRef>
-                        <a:fillRef idx="1">
-                          <a:schemeClr val="accent1"/>
-                        </a:fillRef>
-                        <a:effectRef idx="0">
-                          <a:srgbClr val="FFFFFF"/>
-                        </a:effectRef>
-                        <a:fontRef idx="minor">
-                          <a:schemeClr val="lt1"/>
-                        </a:fontRef>
-                      </wps:style>
-                      <wps:txbx>
-                        <w:txbxContent>
-                          <w:p>
-                            <w:pPr>
-                              <w:jc w:val="center"/>
-                              <w:rPr>
-                                <w:rFonts w:hint="default"/>
-                                <w:lang w:val="en-IN"/>
-                              </w:rPr>
-                            </w:pPr>
-                            <w:r>
-                              <w:rPr>
-                                <w:rFonts w:hint="default"/>
-                                <w:lang w:val="en-IN"/>
-                              </w:rPr>
-                              <w:t>start</w:t>
-                            </w:r>
-                          </w:p>
-                        </w:txbxContent>
-                      </wps:txbx>
-                      <wps:bodyPr rot="0" spcFirstLastPara="0" vertOverflow="overflow" horzOverflow="overflow" vert="horz" wrap="square" lIns="91440" tIns="45720" rIns="91440" bIns="45720" numCol="1" spcCol="0" rtlCol="0" fromWordArt="0" anchor="ctr" anchorCtr="0" forceAA="0" compatLnSpc="1">
-                        <a:noAutofit/>
-                      </wps:bodyPr>
-                    </wps:wsp>
-                  </a:graphicData>
-                </a:graphic>
-              </wp:anchor>
-            </w:drawing>
-          </mc:Choice>
-          <mc:Fallback>
-            <w:pict>
-              <v:shape id="_x0000_s1026" o:spid="_x0000_s1026" o:spt="116" type="#_x0000_t116" style="position:absolute;left:0pt;margin-left:12.8pt;margin-top:4.7pt;height:25.5pt;width:80.75pt;z-index:251674624;v-text-anchor:middle;mso-width-relative:page;mso-height-relative:page;" fillcolor="#5B9BD5 [3204]" filled="t" stroked="t" coordsize="21600,21600" o:gfxdata="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">
-                <v:fill on="t" focussize="0,0"/>
-                <v:stroke weight="1pt" color="#2E75B6 [2404]" miterlimit="8" joinstyle="miter"/>
-                <v:imagedata o:title=""/>
-                <o:lock v:ext="edit" aspectratio="f"/>
-                <v:textbox>
-                  <w:txbxContent>
-                    <w:p>
-                      <w:pPr>
-                        <w:jc w:val="center"/>
-                        <w:rPr>
-                          <w:rFonts w:hint="default"/>
-                          <w:lang w:val="en-IN"/>
-                        </w:rPr>
-                      </w:pPr>
-                      <w:r>
-                        <w:rPr>
-                          <w:rFonts w:hint="default"/>
-                          <w:lang w:val="en-IN"/>
-                        </w:rPr>
-                        <w:t>start</w:t>
-                      </w:r>
-                    </w:p>
-                  </w:txbxContent>
-                </v:textbox>
-              </v:shape>
-            </w:pict>
-          </mc:Fallback>
-        </mc:AlternateContent>
-      </w:r>
-      <w:r>
-        <w:rPr>
-          <w:sz w:val="20"/>
-        </w:rPr>
-        <mc:AlternateContent>
-          <mc:Choice Requires="wps">
-            <w:drawing>
-              <wp:anchor distT="0" distB="0" distL="114300" distR="114300" simplePos="0" relativeHeight="251682816" behindDoc="0" locked="0" layoutInCell="1" allowOverlap="1">
-                <wp:simplePos x="0" y="0"/>
-                <wp:positionH relativeFrom="column">
-                  <wp:posOffset>504825</wp:posOffset>
-                </wp:positionH>
-                <wp:positionV relativeFrom="paragraph">
-                  <wp:posOffset>2519045</wp:posOffset>
-                </wp:positionV>
-                <wp:extent cx="75565" cy="240030"/>
-                <wp:effectExtent l="15240" t="6350" r="15875" b="12700"/>
-                <wp:wrapNone/>
-                <wp:docPr id="27" name="Down Arrow 27"/>
-                <wp:cNvGraphicFramePr/>
-                <a:graphic xmlns:a="http://schemas.openxmlformats.org/drawingml/2006/main">
-                  <a:graphicData uri="http://schemas.microsoft.com/office/word/2010/wordprocessingShape">
-                    <wps:wsp>
-                      <wps:cNvSpPr/>
-                      <wps:spPr>
-                        <a:xfrm>
-                          <a:off x="1647825" y="9634220"/>
-                          <a:ext cx="75565" cy="240030"/>
-                        </a:xfrm>
-                        <a:prstGeom prst="downArrow">
-                          <a:avLst/>
-                        </a:prstGeom>
-                      </wps:spPr>
-                      <wps:style>
-                        <a:lnRef idx="2">
-                          <a:schemeClr val="accent1">
-                            <a:lumMod val="75000"/>
-                          </a:schemeClr>
-                        </a:lnRef>
-                        <a:fillRef idx="1">
-                          <a:schemeClr val="accent1"/>
-                        </a:fillRef>
-                        <a:effectRef idx="0">
-                          <a:srgbClr val="FFFFFF"/>
-                        </a:effectRef>
-                        <a:fontRef idx="minor">
-                          <a:schemeClr val="lt1"/>
-                        </a:fontRef>
-                      </wps:style>
-                      <wps:bodyPr rot="0" spcFirstLastPara="0" vertOverflow="overflow" horzOverflow="overflow" vert="horz" wrap="square" lIns="91440" tIns="45720" rIns="91440" bIns="45720" numCol="1" spcCol="0" rtlCol="0" fromWordArt="0" anchor="ctr" anchorCtr="0" forceAA="0" compatLnSpc="1">
-                        <a:noAutofit/>
-                      </wps:bodyPr>
-                    </wps:wsp>
-                  </a:graphicData>
-                </a:graphic>
-              </wp:anchor>
-            </w:drawing>
-          </mc:Choice>
-          <mc:Fallback>
-            <w:pict>
-              <v:shape id="_x0000_s1026" o:spid="_x0000_s1026" o:spt="67" type="#_x0000_t67" style="position:absolute;left:0pt;margin-left:39.75pt;margin-top:198.35pt;height:18.9pt;width:5.95pt;z-index:251682816;v-text-anchor:middle;mso-width-relative:page;mso-height-relative:page;" fillcolor="#5B9BD5 [3204]" filled="t" stroked="t" coordsize="21600,21600" o:gfxdata="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" adj="18200,5400">
-                <v:fill on="t" focussize="0,0"/>
-                <v:stroke weight="1pt" color="#2E75B6 [2404]" miterlimit="8" joinstyle="miter"/>
-                <v:imagedata o:title=""/>
-                <o:lock v:ext="edit" aspectratio="f"/>
-              </v:shape>
-            </w:pict>
-          </mc:Fallback>
-        </mc:AlternateContent>
-      </w:r>
-      <w:r>
-        <w:rPr>
-          <w:sz w:val="20"/>
-        </w:rPr>
-        <mc:AlternateContent>
-          <mc:Choice Requires="wps">
-            <w:drawing>
               <wp:anchor distT="0" distB="0" distL="114300" distR="114300" simplePos="0" relativeHeight="251681792" behindDoc="0" locked="0" layoutInCell="1" allowOverlap="1">
                 <wp:simplePos x="0" y="0"/>
                 <wp:positionH relativeFrom="column">
@@ -2231,76 +2294,6 @@
           <mc:Fallback>
             <w:pict>
               <v:shape id="_x0000_s1026" o:spid="_x0000_s1026" o:spt="67" type="#_x0000_t67" style="position:absolute;left:0pt;margin-left:41.4pt;margin-top:142.6pt;height:18.9pt;width:5.95pt;z-index:251681792;v-text-anchor:middle;mso-width-relative:page;mso-height-relative:page;" fillcolor="#5B9BD5 [3204]" filled="t" stroked="t" coordsize="21600,21600" o:gfxdata="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" adj="18200,5400">
-                <v:fill on="t" focussize="0,0"/>
-                <v:stroke weight="1pt" color="#2E75B6 [2404]" miterlimit="8" joinstyle="miter"/>
-                <v:imagedata o:title=""/>
-                <o:lock v:ext="edit" aspectratio="f"/>
-              </v:shape>
-            </w:pict>
-          </mc:Fallback>
-        </mc:AlternateContent>
-      </w:r>
-      <w:r>
-        <w:rPr>
-          <w:sz w:val="20"/>
-        </w:rPr>
-        <mc:AlternateContent>
-          <mc:Choice Requires="wps">
-            <w:drawing>
-              <wp:anchor distT="0" distB="0" distL="114300" distR="114300" simplePos="0" relativeHeight="251680768" behindDoc="0" locked="0" layoutInCell="1" allowOverlap="1">
-                <wp:simplePos x="0" y="0"/>
-                <wp:positionH relativeFrom="column">
-                  <wp:posOffset>543560</wp:posOffset>
-                </wp:positionH>
-                <wp:positionV relativeFrom="paragraph">
-                  <wp:posOffset>1210945</wp:posOffset>
-                </wp:positionV>
-                <wp:extent cx="75565" cy="168275"/>
-                <wp:effectExtent l="15240" t="6350" r="15875" b="23495"/>
-                <wp:wrapNone/>
-                <wp:docPr id="25" name="Down Arrow 25"/>
-                <wp:cNvGraphicFramePr/>
-                <a:graphic xmlns:a="http://schemas.openxmlformats.org/drawingml/2006/main">
-                  <a:graphicData uri="http://schemas.microsoft.com/office/word/2010/wordprocessingShape">
-                    <wps:wsp>
-                      <wps:cNvSpPr/>
-                      <wps:spPr>
-                        <a:xfrm>
-                          <a:off x="1686560" y="8326120"/>
-                          <a:ext cx="75565" cy="168275"/>
-                        </a:xfrm>
-                        <a:prstGeom prst="downArrow">
-                          <a:avLst/>
-                        </a:prstGeom>
-                      </wps:spPr>
-                      <wps:style>
-                        <a:lnRef idx="2">
-                          <a:schemeClr val="accent1">
-                            <a:lumMod val="75000"/>
-                          </a:schemeClr>
-                        </a:lnRef>
-                        <a:fillRef idx="1">
-                          <a:schemeClr val="accent1"/>
-                        </a:fillRef>
-                        <a:effectRef idx="0">
-                          <a:srgbClr val="FFFFFF"/>
-                        </a:effectRef>
-                        <a:fontRef idx="minor">
-                          <a:schemeClr val="lt1"/>
-                        </a:fontRef>
-                      </wps:style>
-                      <wps:bodyPr rot="0" spcFirstLastPara="0" vertOverflow="overflow" horzOverflow="overflow" vert="horz" wrap="square" lIns="91440" tIns="45720" rIns="91440" bIns="45720" numCol="1" spcCol="0" rtlCol="0" fromWordArt="0" anchor="ctr" anchorCtr="0" forceAA="0" compatLnSpc="1">
-                        <a:noAutofit/>
-                      </wps:bodyPr>
-                    </wps:wsp>
-                  </a:graphicData>
-                </a:graphic>
-              </wp:anchor>
-            </w:drawing>
-          </mc:Choice>
-          <mc:Fallback>
-            <w:pict>
-              <v:shape id="_x0000_s1026" o:spid="_x0000_s1026" o:spt="67" type="#_x0000_t67" style="position:absolute;left:0pt;margin-left:42.8pt;margin-top:95.35pt;height:13.25pt;width:5.95pt;z-index:251680768;v-text-anchor:middle;mso-width-relative:page;mso-height-relative:page;" fillcolor="#5B9BD5 [3204]" filled="t" stroked="t" coordsize="21600,21600" o:gfxdata="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" adj="16751,5400">
                 <v:fill on="t" focussize="0,0"/>
                 <v:stroke weight="1pt" color="#2E75B6 [2404]" miterlimit="8" joinstyle="miter"/>
                 <v:imagedata o:title=""/>
@@ -2489,6 +2482,194 @@
             </w:pict>
           </mc:Fallback>
         </mc:AlternateContent>
+      </w:r>
+    </w:p>
+    <w:p>
+      <w:pPr>
+        <w:rPr>
+          <w:rFonts w:hint="default"/>
+          <w:sz w:val="20"/>
+          <w:lang w:val="en-US"/>
+        </w:rPr>
+      </w:pPr>
+    </w:p>
+    <w:p>
+      <w:pPr>
+        <w:rPr>
+          <w:rFonts w:hint="default"/>
+          <w:sz w:val="20"/>
+          <w:lang w:val="en-US"/>
+        </w:rPr>
+      </w:pPr>
+    </w:p>
+    <w:p>
+      <w:pPr>
+        <w:rPr>
+          <w:rFonts w:hint="default"/>
+          <w:sz w:val="20"/>
+          <w:lang w:val="en-US"/>
+        </w:rPr>
+      </w:pPr>
+    </w:p>
+    <w:p>
+      <w:pPr>
+        <w:rPr>
+          <w:rFonts w:hint="default"/>
+          <w:sz w:val="20"/>
+          <w:lang w:val="en-US"/>
+        </w:rPr>
+      </w:pPr>
+    </w:p>
+    <w:p>
+      <w:pPr>
+        <w:rPr>
+          <w:rFonts w:hint="default"/>
+          <w:sz w:val="20"/>
+          <w:lang w:val="en-US"/>
+        </w:rPr>
+      </w:pPr>
+    </w:p>
+    <w:p>
+      <w:pPr>
+        <w:rPr>
+          <w:rFonts w:hint="default"/>
+          <w:sz w:val="20"/>
+          <w:lang w:val="en-US"/>
+        </w:rPr>
+      </w:pPr>
+    </w:p>
+    <w:p>
+      <w:pPr>
+        <w:rPr>
+          <w:rFonts w:hint="default"/>
+          <w:sz w:val="20"/>
+          <w:lang w:val="en-US"/>
+        </w:rPr>
+      </w:pPr>
+    </w:p>
+    <w:p>
+      <w:pPr>
+        <w:rPr>
+          <w:rFonts w:hint="default"/>
+          <w:sz w:val="20"/>
+          <w:lang w:val="en-US"/>
+        </w:rPr>
+      </w:pPr>
+    </w:p>
+    <w:p>
+      <w:pPr>
+        <w:rPr>
+          <w:rFonts w:hint="default"/>
+          <w:sz w:val="20"/>
+          <w:lang w:val="en-US"/>
+        </w:rPr>
+      </w:pPr>
+    </w:p>
+    <w:p>
+      <w:pPr>
+        <w:rPr>
+          <w:rFonts w:hint="default"/>
+          <w:sz w:val="20"/>
+          <w:lang w:val="en-US"/>
+        </w:rPr>
+      </w:pPr>
+    </w:p>
+    <w:p>
+      <w:pPr>
+        <w:rPr>
+          <w:rFonts w:hint="default"/>
+          <w:sz w:val="20"/>
+          <w:lang w:val="en-US"/>
+        </w:rPr>
+      </w:pPr>
+    </w:p>
+    <w:p>
+      <w:pPr>
+        <w:rPr>
+          <w:rFonts w:hint="default"/>
+          <w:sz w:val="20"/>
+          <w:lang w:val="en-US"/>
+        </w:rPr>
+      </w:pPr>
+    </w:p>
+    <w:p>
+      <w:pPr>
+        <w:rPr>
+          <w:rFonts w:hint="default"/>
+          <w:sz w:val="20"/>
+          <w:lang w:val="en-US"/>
+        </w:rPr>
+      </w:pPr>
+    </w:p>
+    <w:p>
+      <w:pPr>
+        <w:rPr>
+          <w:rFonts w:hint="default"/>
+          <w:sz w:val="20"/>
+          <w:lang w:val="en-US"/>
+        </w:rPr>
+      </w:pPr>
+    </w:p>
+    <w:p>
+      <w:pPr>
+        <w:rPr>
+          <w:rFonts w:hint="default"/>
+          <w:sz w:val="20"/>
+          <w:lang w:val="en-US"/>
+        </w:rPr>
+      </w:pPr>
+    </w:p>
+    <w:p>
+      <w:pPr>
+        <w:rPr>
+          <w:rFonts w:hint="default"/>
+          <w:sz w:val="20"/>
+          <w:lang w:val="en-US"/>
+        </w:rPr>
+      </w:pPr>
+    </w:p>
+    <w:p>
+      <w:pPr>
+        <w:rPr>
+          <w:rFonts w:hint="default"/>
+          <w:sz w:val="20"/>
+          <w:lang w:val="en-US"/>
+        </w:rPr>
+      </w:pPr>
+    </w:p>
+    <w:p>
+      <w:pPr>
+        <w:rPr>
+          <w:rFonts w:hint="default"/>
+          <w:sz w:val="20"/>
+          <w:lang w:val="en-US"/>
+        </w:rPr>
+      </w:pPr>
+    </w:p>
+    <w:p>
+      <w:pPr>
+        <w:rPr>
+          <w:rFonts w:hint="default"/>
+          <w:sz w:val="20"/>
+          <w:lang w:val="en-US"/>
+        </w:rPr>
+      </w:pPr>
+    </w:p>
+    <w:p>
+      <w:pPr>
+        <w:rPr>
+          <w:rFonts w:hint="default"/>
+          <w:sz w:val="20"/>
+          <w:lang w:val="en-US"/>
+        </w:rPr>
+      </w:pPr>
+      <w:r>
+        <w:rPr>
+          <w:rFonts w:hint="default"/>
+          <w:sz w:val="20"/>
+          <w:lang w:val="en-US"/>
+        </w:rPr>
+        <w:t>Q.3</w:t>
       </w:r>
     </w:p>
     <w:sectPr>
@@ -2789,6 +2970,39 @@
       </w:tblCellMar>
     </w:tblPr>
   </w:style>
+  <w:style w:type="paragraph" w:styleId="4">
+    <w:name w:val="footer"/>
+    <w:basedOn w:val="1"/>
+    <w:uiPriority w:val="0"/>
+    <w:pPr>
+      <w:tabs>
+        <w:tab w:val="center" w:pos="4153"/>
+        <w:tab w:val="right" w:pos="8306"/>
+      </w:tabs>
+      <w:snapToGrid w:val="0"/>
+      <w:jc w:val="left"/>
+    </w:pPr>
+    <w:rPr>
+      <w:sz w:val="18"/>
+      <w:szCs w:val="18"/>
+    </w:rPr>
+  </w:style>
+  <w:style w:type="paragraph" w:styleId="5">
+    <w:name w:val="header"/>
+    <w:basedOn w:val="1"/>
+    <w:uiPriority w:val="0"/>
+    <w:pPr>
+      <w:tabs>
+        <w:tab w:val="center" w:pos="4153"/>
+        <w:tab w:val="right" w:pos="8306"/>
+      </w:tabs>
+      <w:snapToGrid w:val="0"/>
+    </w:pPr>
+    <w:rPr>
+      <w:sz w:val="18"/>
+      <w:szCs w:val="18"/>
+    </w:rPr>
+  </w:style>
 </w:styles>
 </file>
 

</xml_diff>